<commit_message>
Generate application letters only for required submission channels
Default to CV, analysis and interview preparation. Require route evidence, voice, humanizer, AI-style assessment and naturalness of at least 90 for required letters and email-only applications. Revise the SBC letter for its mandatory form field. Validation: 912 tests passed, 20 skipped; independent editorial corpus 10/10; application lint and validation passed.
</commit_message>
<xml_diff>
--- a/registry/jobs/20261027_sbc-performanc_e206e632500f4ca8ba516347dc96c0de/application/cover-letter.docx
+++ b/registry/jobs/20261027_sbc-performanc_e206e632500f4ca8ba516347dc96c0de/application/cover-letter.docx
@@ -33,7 +33,7 @@
           <w:szCs w:val="24"/>
           <w:rtl w:val="false"/>
         </w:rPr>
-        <w:t xml:space="preserve">The Senior Go Developer role at SBC Performance asks for someone who can turn business cases into dependable backend services while staying close to product decisions. I am a backend engineer and technical lead with production experience in Go, PHP, APIs, and event-driven systems. I have recently owned backend design for a multi-tenant Go service, and I would welcome the chance to bring that practical architecture work to your lead-generation platform.</w:t>
+        <w:t xml:space="preserve">I build and operate Go services, with a background in PHP and event-driven systems. I’d like to bring that experience to SBC Performance’s lead-generation platform, working on backend design and keeping services reliable in production.</w:t>
       </w:r>
     </w:p>
     <w:p>
@@ -50,7 +50,7 @@
           <w:szCs w:val="24"/>
           <w:rtl w:val="false"/>
         </w:rPr>
-        <w:t xml:space="preserve">In my recent support-platform work, I built a Go gateway that put Intercom and Zendesk behind a vendor-neutral model. It handled tenant-specific data and inbound events, and it enabled the company's first business demonstration of a support AI product. The work involved defining the service boundary and its contracts, then taking those interfaces through implementation to a working product demonstration.</w:t>
+        <w:t xml:space="preserve">In one recent project, I built a Go gateway that gave Intercom and Zendesk a common event model. I owned the backend contracts, tenant-aware ingestion and vendor adapters. It enabled the first business demonstration of a support AI product. I’ve also simplified production data pipelines, removing repeated full-history reads without changing the existing API.</w:t>
       </w:r>
     </w:p>
     <w:p>
@@ -67,7 +67,7 @@
           <w:szCs w:val="24"/>
           <w:rtl w:val="false"/>
         </w:rPr>
-        <w:t xml:space="preserve">I have also worked on production data and automation flows where correctness matters after the first release. I consolidated separate Snowflake-to-Intercom feeds into one engine, removing repeated full-history reads and an existing daily item cap. In a different system, I took technical ownership of production event analytics and made new stream setup modular. Those experiences give me a useful starting point for discussing data modelling, migrations, and operational behaviour with your engineering team. I would first learn your actual lead lifecycle and query patterns rather than assume the bottleneck from outside.</w:t>
+        <w:t xml:space="preserve">I’m looking for a hands-on role where I can work with product colleagues and stay responsible for services after release. My direct experience is in support automation and analytics, so I’d need to learn your lead-generation workflows. I’m based in Italy and work around CET hours.</w:t>
       </w:r>
     </w:p>
     <w:p>
@@ -84,24 +84,7 @@
           <w:szCs w:val="24"/>
           <w:rtl w:val="false"/>
         </w:rPr>
-        <w:t xml:space="preserve">SBC Performance describes a service that combines creative, media buying, and proprietary technology to make growth more measurable. The engineering role has an unusually direct connection to that work: the platform will serve people who need to understand how traffic becomes useful leads. I have collaborated with product and operations colleagues on automation, and I value making the technical model understandable to the people who use its results. My background is in support and analytics platforms, so I would bring transferable backend experience while learning the marketing-specific domain from your team.</w:t>
-      </w:r>
-    </w:p>
-    <w:p>
-      <w:pPr>
-        <w:bidi w:val="false"/>
-        <w:spacing w:after="120" w:before="120" w:line="259.20000000000005"/>
-        <w:jc w:val="left"/>
-      </w:pPr>
-      <w:r>
-        <w:rPr>
-          <w:rFonts w:ascii="Aptos" w:cs="Aptos" w:eastAsia="Aptos" w:hAnsi="Aptos"/>
-          <w:color w:val="000000"/>
-          <w:sz w:val="24"/>
-          <w:szCs w:val="24"/>
-          <w:rtl w:val="false"/>
-        </w:rPr>
-        <w:t xml:space="preserve">I would be glad to discuss how I approach service boundaries, PostgreSQL-backed workflows, and careful review of changes in production. The role's remote, CET-compatible schedule also fits my location in Italy. Thank you for considering my application.</w:t>
+        <w:t xml:space="preserve">I’d welcome a conversation about the platform you’re building and where you need the next engineer to contribute.</w:t>
       </w:r>
     </w:p>
     <w:p>

</xml_diff>